<commit_message>
Update Bluetooth Research Doc
</commit_message>
<xml_diff>
--- a/Documents/Bluetooth Research.docx
+++ b/Documents/Bluetooth Research.docx
@@ -32,7 +32,15 @@
         <w:t>understanding</w:t>
       </w:r>
       <w:r>
-        <w:t xml:space="preserve"> of how we will incorporate Bluetooth with our react native application.</w:t>
+        <w:t xml:space="preserve"> of how we will incorporate Bluetooth with </w:t>
+      </w:r>
+      <w:proofErr w:type="gramStart"/>
+      <w:r>
+        <w:t>our</w:t>
+      </w:r>
+      <w:proofErr w:type="gramEnd"/>
+      <w:r>
+        <w:t xml:space="preserve"> react native application.</w:t>
       </w:r>
     </w:p>
     <w:p>
@@ -87,14 +95,21 @@
         <w:rPr>
           <w:b/>
           <w:bCs/>
+          <w:u w:val="single"/>
+        </w:rPr>
+      </w:pPr>
+    </w:p>
+    <w:p>
+      <w:pPr>
+        <w:rPr>
+          <w:b/>
+          <w:bCs/>
           <w:sz w:val="32"/>
           <w:szCs w:val="32"/>
           <w:u w:val="single"/>
         </w:rPr>
       </w:pPr>
-    </w:p>
-    <w:p>
-      <w:pPr>
+      <w:r>
         <w:rPr>
           <w:b/>
           <w:bCs/>
@@ -102,7 +117,8 @@
           <w:szCs w:val="32"/>
           <w:u w:val="single"/>
         </w:rPr>
-      </w:pPr>
+        <w:t xml:space="preserve">Bluetooth </w:t>
+      </w:r>
       <w:r>
         <w:rPr>
           <w:b/>
@@ -111,7 +127,7 @@
           <w:szCs w:val="32"/>
           <w:u w:val="single"/>
         </w:rPr>
-        <w:t xml:space="preserve">Bluetooth </w:t>
+        <w:t>C</w:t>
       </w:r>
       <w:r>
         <w:rPr>
@@ -121,9 +137,87 @@
           <w:szCs w:val="32"/>
           <w:u w:val="single"/>
         </w:rPr>
-        <w:t>C</w:t>
-      </w:r>
-      <w:r>
+        <w:t>lassic v BLE</w:t>
+      </w:r>
+    </w:p>
+    <w:p>
+      <w:r>
+        <w:t>Bluetooth classic is the original version of Bluetooth and consumes a lot of power. In 2011 Bluetooth Low Energy (BLE) was made available that operates in the same way but consumes much less power, thus the name. It uses 5% or less the power that Bluetooth classic does</w:t>
+      </w:r>
+      <w:r>
+        <w:t>,</w:t>
+      </w:r>
+      <w:r>
+        <w:t xml:space="preserve"> which makes it ideal for long running apps like ours.</w:t>
+      </w:r>
+      <w:r>
+        <w:t xml:space="preserve"> For the purposes of this paper, I will assume the device is BLE capable as most sources indicate it will be. We can confirm with the </w:t>
+      </w:r>
+      <w:proofErr w:type="spellStart"/>
+      <w:r>
+        <w:t>UoA</w:t>
+      </w:r>
+      <w:proofErr w:type="spellEnd"/>
+      <w:r>
+        <w:t xml:space="preserve"> team via our sponsor </w:t>
+      </w:r>
+      <w:proofErr w:type="gramStart"/>
+      <w:r>
+        <w:t>at a later date</w:t>
+      </w:r>
+      <w:proofErr w:type="gramEnd"/>
+      <w:r>
+        <w:t>.</w:t>
+      </w:r>
+    </w:p>
+    <w:p>
+      <w:r>
+        <w:t xml:space="preserve">Source: </w:t>
+      </w:r>
+      <w:hyperlink r:id="rId5" w:history="1">
+        <w:r>
+          <w:rPr>
+            <w:rStyle w:val="Hyperlink"/>
+          </w:rPr>
+          <w:t xml:space="preserve">Geeks for Geeks Tutorial - </w:t>
+        </w:r>
+        <w:r>
+          <w:rPr>
+            <w:rStyle w:val="Hyperlink"/>
+          </w:rPr>
+          <w:t>Bluetooth vs Blueto</w:t>
+        </w:r>
+        <w:r>
+          <w:rPr>
+            <w:rStyle w:val="Hyperlink"/>
+          </w:rPr>
+          <w:t>o</w:t>
+        </w:r>
+        <w:r>
+          <w:rPr>
+            <w:rStyle w:val="Hyperlink"/>
+          </w:rPr>
+          <w:t>th Low Energy</w:t>
+        </w:r>
+      </w:hyperlink>
+    </w:p>
+    <w:p>
+      <w:pPr>
+        <w:rPr>
+          <w:b/>
+          <w:bCs/>
+        </w:rPr>
+      </w:pPr>
+      <w:r>
+        <w:rPr>
+          <w:b/>
+          <w:bCs/>
+        </w:rPr>
+        <w:t>Action Item: Determine exact model of Bluetooth device and if it supports BLE.</w:t>
+      </w:r>
+    </w:p>
+    <w:p>
+      <w:pPr>
         <w:rPr>
           <w:b/>
           <w:bCs/>
@@ -131,64 +225,7 @@
           <w:szCs w:val="32"/>
           <w:u w:val="single"/>
         </w:rPr>
-        <w:t>lassic v BLE</w:t>
-      </w:r>
-    </w:p>
-    <w:p>
-      <w:r>
-        <w:t>Bluetooth classic is the original version of Bluetooth and consumes a lot of power. In 2011 Bluetooth Low Energy (BLE) was made available that operates in the same way but consumes much less power, thus the name. It uses 5% or less the power that Bluetooth classic does</w:t>
-      </w:r>
-      <w:r>
-        <w:t>,</w:t>
-      </w:r>
-      <w:r>
-        <w:t xml:space="preserve"> which makes it ideal for long running apps like ours.</w:t>
-      </w:r>
-      <w:r>
-        <w:t xml:space="preserve"> For the purposes of this paper, I will assume the device is BLE capable as most sources indicate it will be. We can confirm with the </w:t>
-      </w:r>
-      <w:proofErr w:type="spellStart"/>
-      <w:r>
-        <w:t>UoA</w:t>
-      </w:r>
-      <w:proofErr w:type="spellEnd"/>
-      <w:r>
-        <w:t xml:space="preserve"> team via our sponsor at a later date.</w:t>
-      </w:r>
-    </w:p>
-    <w:p>
-      <w:r>
-        <w:t xml:space="preserve">Source: </w:t>
-      </w:r>
-      <w:hyperlink r:id="rId5" w:history="1">
-        <w:r>
-          <w:rPr>
-            <w:rStyle w:val="Hyperlink"/>
-          </w:rPr>
-          <w:t xml:space="preserve">Geeks for Geeks Tutorial - </w:t>
-        </w:r>
-        <w:r>
-          <w:rPr>
-            <w:rStyle w:val="Hyperlink"/>
-          </w:rPr>
-          <w:t>Bluetooth vs Bluetooth Low Energy</w:t>
-        </w:r>
-      </w:hyperlink>
-    </w:p>
-    <w:p>
-      <w:pPr>
-        <w:rPr>
-          <w:b/>
-          <w:bCs/>
-        </w:rPr>
-      </w:pPr>
-      <w:r>
-        <w:rPr>
-          <w:b/>
-          <w:bCs/>
-        </w:rPr>
-        <w:t>Action Item: Determine exact model of Bluetooth device and if it supports BLE.</w:t>
-      </w:r>
+      </w:pPr>
     </w:p>
     <w:p>
       <w:pPr>
@@ -200,9 +237,7 @@
           <w:u w:val="single"/>
         </w:rPr>
       </w:pPr>
-    </w:p>
-    <w:p>
-      <w:pPr>
+      <w:r>
         <w:rPr>
           <w:b/>
           <w:bCs/>
@@ -210,8 +245,143 @@
           <w:szCs w:val="32"/>
           <w:u w:val="single"/>
         </w:rPr>
-      </w:pPr>
-      <w:r>
+        <w:t>Generic Attribute Profile (GATT)</w:t>
+      </w:r>
+    </w:p>
+    <w:p>
+      <w:r>
+        <w:t xml:space="preserve">GATT is a communication model </w:t>
+      </w:r>
+      <w:proofErr w:type="gramStart"/>
+      <w:r>
+        <w:t>at</w:t>
+      </w:r>
+      <w:proofErr w:type="gramEnd"/>
+      <w:r>
+        <w:t xml:space="preserve"> the Bluetooth device itself. The GATT server is what we must communicate with as it owns and exposes all Bluetooth data.</w:t>
+      </w:r>
+      <w:r>
+        <w:t xml:space="preserve"> It seems </w:t>
+      </w:r>
+      <w:proofErr w:type="spellStart"/>
+      <w:r>
+        <w:t>protobuff</w:t>
+      </w:r>
+      <w:proofErr w:type="spellEnd"/>
+      <w:r>
+        <w:t xml:space="preserve"> works on a higher level </w:t>
+      </w:r>
+      <w:proofErr w:type="gramStart"/>
+      <w:r>
+        <w:t>that</w:t>
+      </w:r>
+      <w:proofErr w:type="gramEnd"/>
+      <w:r>
+        <w:t xml:space="preserve"> GATT so we may not need to work with it much but I’m not sure yet. We may need to define READ, WRITE, NOTIFY</w:t>
+      </w:r>
+      <w:proofErr w:type="gramStart"/>
+      <w:r>
+        <w:t>, INDICATE</w:t>
+      </w:r>
+      <w:proofErr w:type="gramEnd"/>
+      <w:r>
+        <w:t xml:space="preserve"> methods. Some of the data from these sources discusses the device side which we aren’t currently responsible for. They may use something like </w:t>
+      </w:r>
+      <w:proofErr w:type="spellStart"/>
+      <w:r>
+        <w:t>nanopb</w:t>
+      </w:r>
+      <w:proofErr w:type="spellEnd"/>
+      <w:r>
+        <w:t xml:space="preserve"> for </w:t>
+      </w:r>
+      <w:proofErr w:type="spellStart"/>
+      <w:r>
+        <w:t>Protobuff</w:t>
+      </w:r>
+      <w:proofErr w:type="spellEnd"/>
+      <w:r>
+        <w:t xml:space="preserve"> on microcontrollers.</w:t>
+      </w:r>
+    </w:p>
+    <w:p>
+      <w:r>
+        <w:t xml:space="preserve">Source: </w:t>
+      </w:r>
+      <w:hyperlink r:id="rId6" w:history="1">
+        <w:r>
+          <w:rPr>
+            <w:rStyle w:val="Hyperlink"/>
+          </w:rPr>
+          <w:t>Fre</w:t>
+        </w:r>
+        <w:r>
+          <w:rPr>
+            <w:rStyle w:val="Hyperlink"/>
+          </w:rPr>
+          <w:t>e</w:t>
+        </w:r>
+        <w:r>
+          <w:rPr>
+            <w:rStyle w:val="Hyperlink"/>
+          </w:rPr>
+          <w:t xml:space="preserve"> Code Camp</w:t>
+        </w:r>
+      </w:hyperlink>
+    </w:p>
+    <w:p>
+      <w:r>
+        <w:t xml:space="preserve">Workflow example illustrates how this may work for us (Uses </w:t>
+      </w:r>
+      <w:proofErr w:type="spellStart"/>
+      <w:r>
+        <w:t>nanopb</w:t>
+      </w:r>
+      <w:proofErr w:type="spellEnd"/>
+      <w:r>
+        <w:t xml:space="preserve">). </w:t>
+      </w:r>
+      <w:hyperlink r:id="rId7" w:history="1">
+        <w:r>
+          <w:rPr>
+            <w:rStyle w:val="Hyperlink"/>
+          </w:rPr>
+          <w:t>LINK</w:t>
+        </w:r>
+      </w:hyperlink>
+    </w:p>
+    <w:p>
+      <w:pPr>
+        <w:rPr>
+          <w:b/>
+          <w:bCs/>
+        </w:rPr>
+      </w:pPr>
+      <w:r>
+        <w:rPr>
+          <w:b/>
+          <w:bCs/>
+        </w:rPr>
+        <w:t xml:space="preserve">Action Item: </w:t>
+      </w:r>
+      <w:r>
+        <w:rPr>
+          <w:b/>
+          <w:bCs/>
+        </w:rPr>
+        <w:t>Nothing yet.</w:t>
+      </w:r>
+    </w:p>
+    <w:p>
+      <w:pPr>
+        <w:rPr>
+          <w:b/>
+          <w:bCs/>
+        </w:rPr>
+      </w:pPr>
+    </w:p>
+    <w:p>
+      <w:pPr>
         <w:rPr>
           <w:b/>
           <w:bCs/>
@@ -219,8 +389,7 @@
           <w:szCs w:val="32"/>
           <w:u w:val="single"/>
         </w:rPr>
-        <w:t>Generic Attribute Profile</w:t>
-      </w:r>
+      </w:pPr>
       <w:r>
         <w:rPr>
           <w:b/>
@@ -229,105 +398,265 @@
           <w:szCs w:val="32"/>
           <w:u w:val="single"/>
         </w:rPr>
-        <w:t xml:space="preserve"> (GATT)</w:t>
-      </w:r>
-    </w:p>
-    <w:p>
-      <w:r>
-        <w:t>GATT is a communication model at the Bluetooth device itself. The GATT server is what we must communicate with as it owns and exposes all Bluetooth data.</w:t>
-      </w:r>
-      <w:r>
-        <w:t xml:space="preserve"> It seems </w:t>
+        <w:lastRenderedPageBreak/>
+        <w:t>Library</w:t>
+      </w:r>
+    </w:p>
+    <w:p>
+      <w:r>
+        <w:t xml:space="preserve">The most frequently advised library for this is </w:t>
+      </w:r>
+      <w:hyperlink r:id="rId8" w:history="1">
+        <w:r>
+          <w:rPr>
+            <w:rStyle w:val="Hyperlink"/>
+          </w:rPr>
+          <w:t>react-na</w:t>
+        </w:r>
+        <w:r>
+          <w:rPr>
+            <w:rStyle w:val="Hyperlink"/>
+          </w:rPr>
+          <w:t>t</w:t>
+        </w:r>
+        <w:r>
+          <w:rPr>
+            <w:rStyle w:val="Hyperlink"/>
+          </w:rPr>
+          <w:t>ive-</w:t>
+        </w:r>
+        <w:proofErr w:type="spellStart"/>
+        <w:r>
+          <w:rPr>
+            <w:rStyle w:val="Hyperlink"/>
+          </w:rPr>
+          <w:t>ble</w:t>
+        </w:r>
+        <w:proofErr w:type="spellEnd"/>
+        <w:r>
+          <w:rPr>
+            <w:rStyle w:val="Hyperlink"/>
+          </w:rPr>
+          <w:t>-</w:t>
+        </w:r>
+        <w:proofErr w:type="spellStart"/>
+        <w:r>
+          <w:rPr>
+            <w:rStyle w:val="Hyperlink"/>
+          </w:rPr>
+          <w:t>plx</w:t>
+        </w:r>
+        <w:proofErr w:type="spellEnd"/>
+      </w:hyperlink>
+      <w:r>
+        <w:t xml:space="preserve">. </w:t>
+      </w:r>
+      <w:r>
+        <w:t xml:space="preserve">There is an alternative </w:t>
+      </w:r>
+      <w:r>
+        <w:t>react-native-</w:t>
       </w:r>
       <w:proofErr w:type="spellStart"/>
       <w:r>
-        <w:t>protobuff</w:t>
+        <w:t>ble</w:t>
       </w:r>
       <w:proofErr w:type="spellEnd"/>
       <w:r>
-        <w:t xml:space="preserve"> works on a higher level that GATT so we may not need to work with it much but I’m not sure yet. We may need to define READ, WRITE, NOTIFY, INDICATE methods. Some of the data from these sources discusses the device side which we aren’t currently responsible for. They may use something like </w:t>
+        <w:t>-manager</w:t>
+      </w:r>
+      <w:r>
+        <w:t xml:space="preserve"> which </w:t>
+      </w:r>
+      <w:hyperlink r:id="rId9" w:history="1">
+        <w:r>
+          <w:rPr>
+            <w:rStyle w:val="Hyperlink"/>
+          </w:rPr>
+          <w:t>some w</w:t>
+        </w:r>
+        <w:r>
+          <w:rPr>
+            <w:rStyle w:val="Hyperlink"/>
+          </w:rPr>
+          <w:t>e</w:t>
+        </w:r>
+        <w:r>
+          <w:rPr>
+            <w:rStyle w:val="Hyperlink"/>
+          </w:rPr>
+          <w:t>bsites</w:t>
+        </w:r>
+      </w:hyperlink>
+      <w:r>
+        <w:t xml:space="preserve"> argue for using. It seems that </w:t>
       </w:r>
       <w:proofErr w:type="spellStart"/>
       <w:r>
-        <w:t>nanopb</w:t>
+        <w:t>plx</w:t>
       </w:r>
       <w:proofErr w:type="spellEnd"/>
       <w:r>
-        <w:t xml:space="preserve"> for </w:t>
+        <w:t xml:space="preserve"> is more </w:t>
+      </w:r>
+      <w:hyperlink r:id="rId10" w:history="1">
+        <w:r>
+          <w:rPr>
+            <w:rStyle w:val="Hyperlink"/>
+          </w:rPr>
+          <w:t>pop</w:t>
+        </w:r>
+        <w:r>
+          <w:rPr>
+            <w:rStyle w:val="Hyperlink"/>
+          </w:rPr>
+          <w:t>u</w:t>
+        </w:r>
+        <w:r>
+          <w:rPr>
+            <w:rStyle w:val="Hyperlink"/>
+          </w:rPr>
+          <w:t>lar</w:t>
+        </w:r>
+      </w:hyperlink>
+      <w:r>
+        <w:t xml:space="preserve"> and </w:t>
+      </w:r>
+      <w:hyperlink r:id="rId11" w:history="1">
+        <w:r>
+          <w:rPr>
+            <w:rStyle w:val="Hyperlink"/>
+          </w:rPr>
+          <w:t>pow</w:t>
+        </w:r>
+        <w:r>
+          <w:rPr>
+            <w:rStyle w:val="Hyperlink"/>
+          </w:rPr>
+          <w:t>e</w:t>
+        </w:r>
+        <w:r>
+          <w:rPr>
+            <w:rStyle w:val="Hyperlink"/>
+          </w:rPr>
+          <w:t>rful</w:t>
+        </w:r>
+      </w:hyperlink>
+      <w:r>
+        <w:t xml:space="preserve"> but manager works best in simple use cases and the code examples I found </w:t>
+      </w:r>
+      <w:hyperlink r:id="rId12" w:history="1">
+        <w:r>
+          <w:rPr>
+            <w:rStyle w:val="Hyperlink"/>
+          </w:rPr>
+          <w:t>HE</w:t>
+        </w:r>
+        <w:r>
+          <w:rPr>
+            <w:rStyle w:val="Hyperlink"/>
+          </w:rPr>
+          <w:t>R</w:t>
+        </w:r>
+        <w:r>
+          <w:rPr>
+            <w:rStyle w:val="Hyperlink"/>
+          </w:rPr>
+          <w:t>E</w:t>
+        </w:r>
+      </w:hyperlink>
+      <w:r>
+        <w:t xml:space="preserve"> really indicate it seems very simple. We should discuss which one we want to use.</w:t>
+      </w:r>
+      <w:r>
+        <w:t xml:space="preserve"> This is a good website discussing the differences: </w:t>
+      </w:r>
+      <w:hyperlink r:id="rId13" w:history="1">
+        <w:r>
+          <w:rPr>
+            <w:rStyle w:val="Hyperlink"/>
+          </w:rPr>
+          <w:t>LIN</w:t>
+        </w:r>
+        <w:r>
+          <w:rPr>
+            <w:rStyle w:val="Hyperlink"/>
+          </w:rPr>
+          <w:t>K</w:t>
+        </w:r>
+      </w:hyperlink>
+    </w:p>
+    <w:p>
+      <w:pPr>
+        <w:rPr>
+          <w:b/>
+          <w:bCs/>
+        </w:rPr>
+      </w:pPr>
+      <w:r>
+        <w:rPr>
+          <w:b/>
+          <w:bCs/>
+        </w:rPr>
+        <w:t xml:space="preserve">Action Item: </w:t>
+      </w:r>
+      <w:r>
+        <w:rPr>
+          <w:b/>
+          <w:bCs/>
+        </w:rPr>
+        <w:t xml:space="preserve">Decide on </w:t>
       </w:r>
       <w:proofErr w:type="spellStart"/>
       <w:r>
-        <w:t>Protobuff</w:t>
+        <w:rPr>
+          <w:b/>
+          <w:bCs/>
+        </w:rPr>
+        <w:t>plx</w:t>
       </w:r>
       <w:proofErr w:type="spellEnd"/>
       <w:r>
-        <w:t xml:space="preserve"> on microcontrollers.</w:t>
-      </w:r>
-    </w:p>
-    <w:p>
-      <w:r>
-        <w:t xml:space="preserve">Source: </w:t>
-      </w:r>
-      <w:hyperlink r:id="rId6" w:history="1">
-        <w:r>
-          <w:rPr>
-            <w:rStyle w:val="Hyperlink"/>
-          </w:rPr>
-          <w:t>Free Code Camp</w:t>
-        </w:r>
-      </w:hyperlink>
-    </w:p>
-    <w:p>
-      <w:r>
-        <w:t xml:space="preserve">Workflow example illustrates how this may work for us (Uses </w:t>
+        <w:rPr>
+          <w:b/>
+          <w:bCs/>
+        </w:rPr>
+        <w:t xml:space="preserve"> or manager library. I would advise </w:t>
       </w:r>
       <w:proofErr w:type="spellStart"/>
       <w:r>
-        <w:t>nanopb</w:t>
+        <w:rPr>
+          <w:b/>
+          <w:bCs/>
+        </w:rPr>
+        <w:t>plx</w:t>
       </w:r>
       <w:proofErr w:type="spellEnd"/>
       <w:r>
-        <w:t xml:space="preserve">). </w:t>
-      </w:r>
-      <w:hyperlink r:id="rId7" w:history="1">
-        <w:r>
-          <w:rPr>
-            <w:rStyle w:val="Hyperlink"/>
-          </w:rPr>
-          <w:t>LINK</w:t>
-        </w:r>
-      </w:hyperlink>
-    </w:p>
-    <w:p>
-      <w:pPr>
-        <w:rPr>
-          <w:b/>
-          <w:bCs/>
-        </w:rPr>
-      </w:pPr>
-      <w:r>
-        <w:rPr>
-          <w:b/>
-          <w:bCs/>
-        </w:rPr>
-        <w:t xml:space="preserve">Action Item: </w:t>
-      </w:r>
-      <w:r>
-        <w:rPr>
-          <w:b/>
-          <w:bCs/>
-        </w:rPr>
-        <w:t>Nothing yet.</w:t>
-      </w:r>
-    </w:p>
-    <w:p>
-      <w:pPr>
-        <w:rPr>
-          <w:b/>
-          <w:bCs/>
-        </w:rPr>
-      </w:pPr>
-    </w:p>
+        <w:rPr>
+          <w:b/>
+          <w:bCs/>
+        </w:rPr>
+        <w:t xml:space="preserve"> </w:t>
+      </w:r>
+      <w:proofErr w:type="gramStart"/>
+      <w:r>
+        <w:rPr>
+          <w:b/>
+          <w:bCs/>
+        </w:rPr>
+        <w:t>do</w:t>
+      </w:r>
+      <w:proofErr w:type="gramEnd"/>
+      <w:r>
+        <w:rPr>
+          <w:b/>
+          <w:bCs/>
+        </w:rPr>
+        <w:t xml:space="preserve"> to extensive documentation but we should discuss.</w:t>
+      </w:r>
+    </w:p>
+    <w:p/>
     <w:p>
       <w:pPr>
         <w:rPr>
@@ -346,127 +675,177 @@
           <w:szCs w:val="32"/>
           <w:u w:val="single"/>
         </w:rPr>
-        <w:lastRenderedPageBreak/>
-        <w:t>Library</w:t>
-      </w:r>
-    </w:p>
-    <w:p>
-      <w:r>
-        <w:t xml:space="preserve">The most frequently advised library for this is </w:t>
-      </w:r>
-      <w:hyperlink r:id="rId8" w:history="1">
-        <w:r>
-          <w:rPr>
-            <w:rStyle w:val="Hyperlink"/>
-          </w:rPr>
-          <w:t>react-native-</w:t>
-        </w:r>
-        <w:proofErr w:type="spellStart"/>
-        <w:r>
-          <w:rPr>
-            <w:rStyle w:val="Hyperlink"/>
-          </w:rPr>
-          <w:t>ble</w:t>
-        </w:r>
-        <w:proofErr w:type="spellEnd"/>
-        <w:r>
-          <w:rPr>
-            <w:rStyle w:val="Hyperlink"/>
-          </w:rPr>
-          <w:t>-</w:t>
-        </w:r>
-        <w:proofErr w:type="spellStart"/>
-        <w:r>
-          <w:rPr>
-            <w:rStyle w:val="Hyperlink"/>
-          </w:rPr>
-          <w:t>plx</w:t>
-        </w:r>
-        <w:proofErr w:type="spellEnd"/>
+        <w:t>Expo Development Build</w:t>
+      </w:r>
+    </w:p>
+    <w:p>
+      <w:r>
+        <w:t>Expo Go (the mobile App) won’t work for using Bluetooth as it doesn’t include react-native-</w:t>
+      </w:r>
+      <w:proofErr w:type="spellStart"/>
+      <w:r>
+        <w:t>ble</w:t>
+      </w:r>
+      <w:proofErr w:type="spellEnd"/>
+      <w:r>
+        <w:t>-</w:t>
+      </w:r>
+      <w:proofErr w:type="spellStart"/>
+      <w:r>
+        <w:t>plx</w:t>
+      </w:r>
+      <w:proofErr w:type="spellEnd"/>
+      <w:r>
+        <w:t xml:space="preserve"> and can’t load it. We must use a development build or a physical android and IOS phone. This </w:t>
+      </w:r>
+      <w:hyperlink r:id="rId14" w:history="1">
+        <w:r>
+          <w:rPr>
+            <w:rStyle w:val="Hyperlink"/>
+          </w:rPr>
+          <w:t>web</w:t>
+        </w:r>
+        <w:r>
+          <w:rPr>
+            <w:rStyle w:val="Hyperlink"/>
+          </w:rPr>
+          <w:t>s</w:t>
+        </w:r>
+        <w:r>
+          <w:rPr>
+            <w:rStyle w:val="Hyperlink"/>
+          </w:rPr>
+          <w:t xml:space="preserve">ite </w:t>
+        </w:r>
       </w:hyperlink>
       <w:r>
-        <w:t xml:space="preserve">. </w:t>
-      </w:r>
-      <w:r>
-        <w:t xml:space="preserve">There is an alternative </w:t>
-      </w:r>
-      <w:r>
-        <w:t>react-native-</w:t>
+        <w:t xml:space="preserve">offers a detailed look at how we can proceed if we choose the </w:t>
       </w:r>
       <w:proofErr w:type="spellStart"/>
       <w:r>
-        <w:t>ble</w:t>
+        <w:t>plx</w:t>
       </w:r>
       <w:proofErr w:type="spellEnd"/>
       <w:r>
-        <w:t>-manager</w:t>
-      </w:r>
-      <w:r>
-        <w:t xml:space="preserve"> which </w:t>
-      </w:r>
-      <w:hyperlink r:id="rId9" w:history="1">
-        <w:r>
-          <w:rPr>
-            <w:rStyle w:val="Hyperlink"/>
-          </w:rPr>
-          <w:t>some websites</w:t>
+        <w:t xml:space="preserve"> library.</w:t>
+      </w:r>
+      <w:r>
+        <w:t xml:space="preserve"> It has a lot of example code and even a video.</w:t>
+      </w:r>
+    </w:p>
+    <w:p>
+      <w:r>
+        <w:t xml:space="preserve">An expo development build just means building the application like you normally would and then loading it onto your device. This is </w:t>
+      </w:r>
+      <w:proofErr w:type="gramStart"/>
+      <w:r>
+        <w:t>similar to</w:t>
+      </w:r>
+      <w:proofErr w:type="gramEnd"/>
+      <w:r>
+        <w:t xml:space="preserve"> making a .jar or .exe file in Java.</w:t>
+      </w:r>
+    </w:p>
+    <w:p>
+      <w:r>
+        <w:fldChar w:fldCharType="begin"/>
+      </w:r>
+      <w:r>
+        <w:instrText>HYPERLINK "https://docs.expo.dev/develop/development-builds/expo-go-to-dev-build/"</w:instrText>
+      </w:r>
+      <w:r>
+        <w:fldChar w:fldCharType="separate"/>
+      </w:r>
+      <w:r>
+        <w:rPr>
+          <w:rStyle w:val="Hyperlink"/>
+        </w:rPr>
+        <w:t>He</w:t>
+      </w:r>
+      <w:r>
+        <w:rPr>
+          <w:rStyle w:val="Hyperlink"/>
+        </w:rPr>
+        <w:t>r</w:t>
+      </w:r>
+      <w:r>
+        <w:rPr>
+          <w:rStyle w:val="Hyperlink"/>
+        </w:rPr>
+        <w:t>e</w:t>
+      </w:r>
+      <w:r>
+        <w:fldChar w:fldCharType="end"/>
+      </w:r>
+      <w:r>
+        <w:t xml:space="preserve"> is a rundown on what you need to do. EAS makes it easier and you can find that </w:t>
+      </w:r>
+      <w:hyperlink r:id="rId15" w:history="1">
+        <w:r>
+          <w:rPr>
+            <w:rStyle w:val="Hyperlink"/>
+          </w:rPr>
+          <w:t>here</w:t>
         </w:r>
       </w:hyperlink>
       <w:r>
-        <w:t xml:space="preserve"> argue for using. It seems that </w:t>
+        <w:t xml:space="preserve"> but there is the issue of needing a paid IOS developer account at </w:t>
+      </w:r>
+      <w:hyperlink r:id="rId16" w:history="1">
+        <w:r>
+          <w:rPr>
+            <w:rStyle w:val="Hyperlink"/>
+          </w:rPr>
+          <w:t>$99/year</w:t>
+        </w:r>
+      </w:hyperlink>
+      <w:r>
+        <w:t xml:space="preserve"> for it to work with IOS. Even with the account it seems to still need MacOS. Someone other than I will likely need to handle IOS testing!</w:t>
+      </w:r>
+    </w:p>
+    <w:p>
+      <w:r>
+        <w:t xml:space="preserve">Setup instructions have been added to RAEDME.md file. A new </w:t>
       </w:r>
       <w:proofErr w:type="spellStart"/>
       <w:r>
-        <w:t>plx</w:t>
+        <w:t>app.json</w:t>
       </w:r>
       <w:proofErr w:type="spellEnd"/>
       <w:r>
-        <w:t xml:space="preserve"> is more </w:t>
-      </w:r>
-      <w:hyperlink r:id="rId10" w:history="1">
-        <w:r>
-          <w:rPr>
-            <w:rStyle w:val="Hyperlink"/>
-          </w:rPr>
-          <w:t>popular</w:t>
+        <w:t xml:space="preserve"> file has been created named ‘</w:t>
+      </w:r>
+      <w:proofErr w:type="spellStart"/>
+      <w:r>
+        <w:t>app_with_BLE.json</w:t>
+      </w:r>
+      <w:proofErr w:type="spellEnd"/>
+      <w:r>
+        <w:t xml:space="preserve">’. It does nothing now but when swapped, it will set up the app for us to require an expo dev build and use the permissions we will need. Using it now will just hinder our existing workflow. You can read more about permissions </w:t>
+      </w:r>
+      <w:hyperlink r:id="rId17" w:history="1">
+        <w:r>
+          <w:rPr>
+            <w:rStyle w:val="Hyperlink"/>
+          </w:rPr>
+          <w:t>HE</w:t>
+        </w:r>
+        <w:r>
+          <w:rPr>
+            <w:rStyle w:val="Hyperlink"/>
+          </w:rPr>
+          <w:t>R</w:t>
+        </w:r>
+        <w:r>
+          <w:rPr>
+            <w:rStyle w:val="Hyperlink"/>
+          </w:rPr>
+          <w:t>E</w:t>
         </w:r>
       </w:hyperlink>
       <w:r>
-        <w:t xml:space="preserve"> and </w:t>
-      </w:r>
-      <w:hyperlink r:id="rId11" w:history="1">
-        <w:r>
-          <w:rPr>
-            <w:rStyle w:val="Hyperlink"/>
-          </w:rPr>
-          <w:t>powerful</w:t>
-        </w:r>
-      </w:hyperlink>
-      <w:r>
-        <w:t xml:space="preserve"> but manager works best in simple use cases and the code examples I found </w:t>
-      </w:r>
-      <w:hyperlink r:id="rId12" w:history="1">
-        <w:r>
-          <w:rPr>
-            <w:rStyle w:val="Hyperlink"/>
-          </w:rPr>
-          <w:t>HERE</w:t>
-        </w:r>
-      </w:hyperlink>
-      <w:r>
-        <w:t xml:space="preserve"> really indicate it seems very simple. We should discuss which one we want to use.</w:t>
-      </w:r>
-      <w:r>
-        <w:t xml:space="preserve"> This is a good website discussing the differences: </w:t>
-      </w:r>
-      <w:hyperlink r:id="rId13" w:history="1">
-        <w:r>
-          <w:rPr>
-            <w:rStyle w:val="Hyperlink"/>
-          </w:rPr>
-          <w:t>LINK</w:t>
-        </w:r>
-      </w:hyperlink>
+        <w:t>.</w:t>
+      </w:r>
     </w:p>
     <w:p>
       <w:pPr>
@@ -487,39 +866,7 @@
           <w:b/>
           <w:bCs/>
         </w:rPr>
-        <w:t xml:space="preserve">Decide on </w:t>
-      </w:r>
-      <w:proofErr w:type="spellStart"/>
-      <w:r>
-        <w:rPr>
-          <w:b/>
-          <w:bCs/>
-        </w:rPr>
-        <w:t>plx</w:t>
-      </w:r>
-      <w:proofErr w:type="spellEnd"/>
-      <w:r>
-        <w:rPr>
-          <w:b/>
-          <w:bCs/>
-        </w:rPr>
-        <w:t xml:space="preserve"> or manager library. I would advise </w:t>
-      </w:r>
-      <w:proofErr w:type="spellStart"/>
-      <w:r>
-        <w:rPr>
-          <w:b/>
-          <w:bCs/>
-        </w:rPr>
-        <w:t>plx</w:t>
-      </w:r>
-      <w:proofErr w:type="spellEnd"/>
-      <w:r>
-        <w:rPr>
-          <w:b/>
-          <w:bCs/>
-        </w:rPr>
-        <w:t xml:space="preserve"> do to extensive documentation but we should discuss.</w:t>
+        <w:t>Mentally prepare to need a developer build setup. Decide who will test IOS and android specific builds.</w:t>
       </w:r>
     </w:p>
     <w:p/>
@@ -541,418 +888,471 @@
           <w:szCs w:val="32"/>
           <w:u w:val="single"/>
         </w:rPr>
-        <w:t>Expo Development Build</w:t>
-      </w:r>
-    </w:p>
-    <w:p>
-      <w:r>
-        <w:t>Expo Go (the mobile App) won’t work for using Bluetooth as it doesn’t include react-native-</w:t>
+        <w:t>Permissions</w:t>
+      </w:r>
+    </w:p>
+    <w:p>
+      <w:r>
+        <w:t xml:space="preserve">This example code was provided </w:t>
+      </w:r>
+      <w:hyperlink r:id="rId18" w:history="1">
+        <w:r>
+          <w:rPr>
+            <w:rStyle w:val="Hyperlink"/>
+          </w:rPr>
+          <w:t>HER</w:t>
+        </w:r>
+        <w:r>
+          <w:rPr>
+            <w:rStyle w:val="Hyperlink"/>
+          </w:rPr>
+          <w:t>E</w:t>
+        </w:r>
+      </w:hyperlink>
+      <w:r>
+        <w:t xml:space="preserve"> to get permissions from IOS and Android for Bluetooth. </w:t>
+      </w:r>
+      <w:r>
+        <w:t>I moved the code example to the README.md. IOS permissions are automatically requested by having the “</w:t>
       </w:r>
       <w:proofErr w:type="spellStart"/>
       <w:r>
-        <w:t>ble</w:t>
+        <w:t>NSBluetoothAlwaysUsageDescription</w:t>
       </w:r>
       <w:proofErr w:type="spellEnd"/>
       <w:r>
-        <w:t>-</w:t>
+        <w:t xml:space="preserve">” flag in </w:t>
       </w:r>
       <w:proofErr w:type="spellStart"/>
+      <w:proofErr w:type="gramStart"/>
+      <w:r>
+        <w:lastRenderedPageBreak/>
+        <w:t>app.json</w:t>
+      </w:r>
+      <w:proofErr w:type="spellEnd"/>
+      <w:proofErr w:type="gramEnd"/>
+      <w:r>
+        <w:t xml:space="preserve">. It’s present in the new version. For android 31 and up we need to explicitly request Bluetooth permissions as seen in the example. If below Android 31 we only need to request, ACCESS_FINE_LOCATION as the rest </w:t>
+      </w:r>
+      <w:proofErr w:type="gramStart"/>
+      <w:r>
+        <w:t>are</w:t>
+      </w:r>
+      <w:proofErr w:type="gramEnd"/>
+      <w:r>
+        <w:t xml:space="preserve"> install time permissions that will be requested at install.</w:t>
+      </w:r>
+    </w:p>
+    <w:p>
+      <w:r>
+        <w:t>There is a</w:t>
+      </w:r>
+      <w:r>
+        <w:t>n extensive</w:t>
+      </w:r>
+      <w:r>
+        <w:t xml:space="preserve"> </w:t>
+      </w:r>
+      <w:proofErr w:type="spellStart"/>
       <w:r>
         <w:t>plx</w:t>
       </w:r>
       <w:proofErr w:type="spellEnd"/>
       <w:r>
-        <w:t xml:space="preserve"> and can’t load it. We must use a development build or a physical android and IOS phone. This </w:t>
-      </w:r>
-      <w:hyperlink r:id="rId14" w:history="1">
-        <w:r>
-          <w:rPr>
-            <w:rStyle w:val="Hyperlink"/>
-          </w:rPr>
-          <w:t xml:space="preserve">website </w:t>
+        <w:t xml:space="preserve"> example </w:t>
+      </w:r>
+      <w:hyperlink r:id="rId19" w:anchor="android-example-setup" w:history="1">
+        <w:r>
+          <w:rPr>
+            <w:rStyle w:val="Hyperlink"/>
+          </w:rPr>
+          <w:t>HERE</w:t>
         </w:r>
       </w:hyperlink>
       <w:r>
-        <w:t xml:space="preserve">offers a detailed look at how we can proceed if we choose the </w:t>
+        <w:t>.</w:t>
+      </w:r>
+    </w:p>
+    <w:p>
+      <w:r>
+        <w:t xml:space="preserve">Android permission documentation can be found </w:t>
+      </w:r>
+      <w:hyperlink r:id="rId20" w:history="1">
+        <w:r>
+          <w:rPr>
+            <w:rStyle w:val="Hyperlink"/>
+          </w:rPr>
+          <w:t>HE</w:t>
+        </w:r>
+        <w:r>
+          <w:rPr>
+            <w:rStyle w:val="Hyperlink"/>
+          </w:rPr>
+          <w:t>R</w:t>
+        </w:r>
+        <w:r>
+          <w:rPr>
+            <w:rStyle w:val="Hyperlink"/>
+          </w:rPr>
+          <w:t>E</w:t>
+        </w:r>
+      </w:hyperlink>
+      <w:r>
+        <w:t>.</w:t>
+      </w:r>
+    </w:p>
+    <w:p>
+      <w:pPr>
+        <w:rPr>
+          <w:b/>
+          <w:bCs/>
+        </w:rPr>
+      </w:pPr>
+      <w:r>
+        <w:rPr>
+          <w:b/>
+          <w:bCs/>
+        </w:rPr>
+        <w:t xml:space="preserve">Action Item: </w:t>
+      </w:r>
+      <w:r>
+        <w:rPr>
+          <w:b/>
+          <w:bCs/>
+        </w:rPr>
+        <w:t>None for now.</w:t>
+      </w:r>
+    </w:p>
+    <w:p>
+      <w:pPr>
+        <w:rPr>
+          <w:b/>
+          <w:bCs/>
+        </w:rPr>
+      </w:pPr>
+    </w:p>
+    <w:p>
+      <w:pPr>
+        <w:rPr>
+          <w:b/>
+          <w:bCs/>
+        </w:rPr>
+      </w:pPr>
+    </w:p>
+    <w:p>
+      <w:pPr>
+        <w:rPr>
+          <w:b/>
+          <w:bCs/>
+        </w:rPr>
+      </w:pPr>
+      <w:r>
+        <w:rPr>
+          <w:b/>
+          <w:bCs/>
+        </w:rPr>
+        <w:t>Links:</w:t>
+      </w:r>
+    </w:p>
+    <w:p>
+      <w:hyperlink r:id="rId21" w:history="1">
+        <w:r>
+          <w:rPr>
+            <w:rStyle w:val="Hyperlink"/>
+          </w:rPr>
+          <w:t>Switch from Expo Go to a development build - Expo Documentation</w:t>
+        </w:r>
+      </w:hyperlink>
+      <w:r>
+        <w:t xml:space="preserve"> – This page is from the expo docs and details creating and running an expo development build</w:t>
+      </w:r>
+    </w:p>
+    <w:p>
+      <w:hyperlink r:id="rId22" w:history="1">
+        <w:r>
+          <w:rPr>
+            <w:rStyle w:val="Hyperlink"/>
+          </w:rPr>
+          <w:t xml:space="preserve">Bluetooth </w:t>
+        </w:r>
+        <w:proofErr w:type="gramStart"/>
+        <w:r>
+          <w:rPr>
+            <w:rStyle w:val="Hyperlink"/>
+          </w:rPr>
+          <w:t>permissions  |</w:t>
+        </w:r>
+        <w:proofErr w:type="gramEnd"/>
+        <w:r>
+          <w:rPr>
+            <w:rStyle w:val="Hyperlink"/>
+          </w:rPr>
+          <w:t xml:space="preserve">  </w:t>
+        </w:r>
+        <w:proofErr w:type="gramStart"/>
+        <w:r>
+          <w:rPr>
+            <w:rStyle w:val="Hyperlink"/>
+          </w:rPr>
+          <w:t>Connectivity  |</w:t>
+        </w:r>
+        <w:proofErr w:type="gramEnd"/>
+        <w:r>
+          <w:rPr>
+            <w:rStyle w:val="Hyperlink"/>
+          </w:rPr>
+          <w:t>  Android Developers</w:t>
+        </w:r>
+      </w:hyperlink>
+      <w:r>
+        <w:t xml:space="preserve"> – This page shows android permissions and how they work specifically for Bluetooth.</w:t>
+      </w:r>
+    </w:p>
+    <w:p>
+      <w:hyperlink r:id="rId23" w:history="1">
+        <w:r>
+          <w:rPr>
+            <w:rStyle w:val="Hyperlink"/>
+          </w:rPr>
+          <w:t>React Native BLE Manager: Step-by-Step Guide for Scanning and Data | JavaScript in Plain English</w:t>
+        </w:r>
+      </w:hyperlink>
+      <w:r>
+        <w:t xml:space="preserve"> – Bluetooth Manager library guide.</w:t>
+      </w:r>
+    </w:p>
+    <w:p>
+      <w:hyperlink r:id="rId24" w:history="1">
+        <w:r>
+          <w:rPr>
+            <w:rStyle w:val="Hyperlink"/>
+          </w:rPr>
+          <w:t>Permissions - Expo Documentation</w:t>
+        </w:r>
+      </w:hyperlink>
+      <w:r>
+        <w:t xml:space="preserve"> – Expo permissions guide from expo docs.</w:t>
+      </w:r>
+    </w:p>
+    <w:p>
+      <w:hyperlink r:id="rId25" w:history="1">
+        <w:r>
+          <w:rPr>
+            <w:rStyle w:val="Hyperlink"/>
+          </w:rPr>
+          <w:t>How to build a Bluetooth Low Energy powered Expo app</w:t>
+        </w:r>
+      </w:hyperlink>
+      <w:r>
+        <w:t xml:space="preserve"> – Expo blog about BLE in Expo. Includes very in-depth code options.</w:t>
+      </w:r>
+    </w:p>
+    <w:p>
+      <w:hyperlink r:id="rId26" w:history="1">
+        <w:r>
+          <w:rPr>
+            <w:rStyle w:val="Hyperlink"/>
+          </w:rPr>
+          <w:t xml:space="preserve">Comparing React Native BLE libraries - </w:t>
+        </w:r>
+        <w:proofErr w:type="spellStart"/>
+        <w:r>
+          <w:rPr>
+            <w:rStyle w:val="Hyperlink"/>
+          </w:rPr>
+          <w:t>LogRocket</w:t>
+        </w:r>
+        <w:proofErr w:type="spellEnd"/>
+        <w:r>
+          <w:rPr>
+            <w:rStyle w:val="Hyperlink"/>
+          </w:rPr>
+          <w:t xml:space="preserve"> Blog</w:t>
+        </w:r>
+      </w:hyperlink>
+      <w:r>
+        <w:t xml:space="preserve"> – Blog about BLE v Manager libraries.</w:t>
+      </w:r>
+    </w:p>
+    <w:p>
+      <w:hyperlink r:id="rId27" w:history="1">
+        <w:r>
+          <w:rPr>
+            <w:rStyle w:val="Hyperlink"/>
+          </w:rPr>
+          <w:t>react-native-</w:t>
+        </w:r>
+        <w:proofErr w:type="spellStart"/>
+        <w:r>
+          <w:rPr>
+            <w:rStyle w:val="Hyperlink"/>
+          </w:rPr>
+          <w:t>ble</w:t>
+        </w:r>
+        <w:proofErr w:type="spellEnd"/>
+        <w:r>
+          <w:rPr>
+            <w:rStyle w:val="Hyperlink"/>
+          </w:rPr>
+          <w:t>-manager vs react-native-</w:t>
+        </w:r>
+        <w:proofErr w:type="spellStart"/>
+        <w:r>
+          <w:rPr>
+            <w:rStyle w:val="Hyperlink"/>
+          </w:rPr>
+          <w:t>ble</w:t>
+        </w:r>
+        <w:proofErr w:type="spellEnd"/>
+        <w:r>
+          <w:rPr>
+            <w:rStyle w:val="Hyperlink"/>
+          </w:rPr>
+          <w:t>-</w:t>
+        </w:r>
+        <w:proofErr w:type="spellStart"/>
+        <w:r>
+          <w:rPr>
+            <w:rStyle w:val="Hyperlink"/>
+          </w:rPr>
+          <w:t>plx</w:t>
+        </w:r>
+        <w:proofErr w:type="spellEnd"/>
+        <w:r>
+          <w:rPr>
+            <w:rStyle w:val="Hyperlink"/>
+          </w:rPr>
+          <w:t xml:space="preserve"> | </w:t>
+        </w:r>
+        <w:proofErr w:type="spellStart"/>
+        <w:r>
+          <w:rPr>
+            <w:rStyle w:val="Hyperlink"/>
+          </w:rPr>
+          <w:t>npm</w:t>
+        </w:r>
+        <w:proofErr w:type="spellEnd"/>
+        <w:r>
+          <w:rPr>
+            <w:rStyle w:val="Hyperlink"/>
+          </w:rPr>
+          <w:t xml:space="preserve"> trends</w:t>
+        </w:r>
+      </w:hyperlink>
+      <w:r>
+        <w:t xml:space="preserve"> – manager comparison by </w:t>
       </w:r>
       <w:proofErr w:type="spellStart"/>
       <w:r>
-        <w:t>plx</w:t>
+        <w:t>npm</w:t>
       </w:r>
       <w:proofErr w:type="spellEnd"/>
       <w:r>
-        <w:t xml:space="preserve"> library.</w:t>
-      </w:r>
-      <w:r>
-        <w:t xml:space="preserve"> It has a lot of example code and even a video.</w:t>
-      </w:r>
-    </w:p>
-    <w:p>
-      <w:r>
-        <w:t>An expo development build just means building the application like you normally would and then loading it onto your device. This is similar to making a .jar or .exe file in Java.</w:t>
-      </w:r>
-    </w:p>
-    <w:p>
-      <w:hyperlink r:id="rId15" w:history="1">
-        <w:r>
-          <w:rPr>
-            <w:rStyle w:val="Hyperlink"/>
-          </w:rPr>
-          <w:t>Here</w:t>
+        <w:t>.</w:t>
+      </w:r>
+    </w:p>
+    <w:p>
+      <w:hyperlink r:id="rId28" w:history="1">
+        <w:r>
+          <w:rPr>
+            <w:rStyle w:val="Hyperlink"/>
+          </w:rPr>
+          <w:t>react-native-</w:t>
+        </w:r>
+        <w:proofErr w:type="spellStart"/>
+        <w:r>
+          <w:rPr>
+            <w:rStyle w:val="Hyperlink"/>
+          </w:rPr>
+          <w:t>ble</w:t>
+        </w:r>
+        <w:proofErr w:type="spellEnd"/>
+        <w:r>
+          <w:rPr>
+            <w:rStyle w:val="Hyperlink"/>
+          </w:rPr>
+          <w:t>-</w:t>
+        </w:r>
+        <w:proofErr w:type="spellStart"/>
+        <w:r>
+          <w:rPr>
+            <w:rStyle w:val="Hyperlink"/>
+          </w:rPr>
+          <w:t>plx</w:t>
+        </w:r>
+        <w:proofErr w:type="spellEnd"/>
+        <w:r>
+          <w:rPr>
+            <w:rStyle w:val="Hyperlink"/>
+          </w:rPr>
+          <w:t xml:space="preserve"> 3.3.0 | Documentation</w:t>
         </w:r>
       </w:hyperlink>
       <w:r>
-        <w:t xml:space="preserve"> is a rundown on what you need to do. EAS makes it easier and you can find that </w:t>
-      </w:r>
-      <w:hyperlink r:id="rId16" w:history="1">
-        <w:r>
-          <w:rPr>
-            <w:rStyle w:val="Hyperlink"/>
-          </w:rPr>
-          <w:t>here</w:t>
-        </w:r>
+        <w:t xml:space="preserve"> – BLE PLX official do</w:t>
+      </w:r>
+      <w:r>
+        <w:t>c</w:t>
+      </w:r>
+      <w:r>
+        <w:t>umentation.</w:t>
+      </w:r>
+    </w:p>
+    <w:p>
+      <w:hyperlink r:id="rId29" w:history="1">
+        <w:r>
+          <w:rPr>
+            <w:rStyle w:val="Hyperlink"/>
+          </w:rPr>
+          <w:t xml:space="preserve">How to Protocol Buffer Bluetooth Low Energy Services – </w:t>
+        </w:r>
+        <w:proofErr w:type="spellStart"/>
+        <w:r>
+          <w:rPr>
+            <w:rStyle w:val="Hyperlink"/>
+          </w:rPr>
+          <w:t>TheLinuxCode</w:t>
+        </w:r>
+        <w:proofErr w:type="spellEnd"/>
       </w:hyperlink>
       <w:r>
-        <w:t xml:space="preserve"> but there is the issue of needing a paid IOS developer account at </w:t>
-      </w:r>
-      <w:hyperlink r:id="rId17" w:history="1">
-        <w:r>
-          <w:rPr>
-            <w:rStyle w:val="Hyperlink"/>
-          </w:rPr>
-          <w:t>$99/year</w:t>
+        <w:t xml:space="preserve"> – Guide on protocol Buffers and BLE.</w:t>
+      </w:r>
+    </w:p>
+    <w:p>
+      <w:hyperlink r:id="rId30" w:history="1">
+        <w:r>
+          <w:rPr>
+            <w:rStyle w:val="Hyperlink"/>
+          </w:rPr>
+          <w:t>How Bluetooth Low Energy Devices Work: GATT Services and Characteristics Explained</w:t>
         </w:r>
       </w:hyperlink>
       <w:r>
-        <w:t xml:space="preserve"> for it to work with IOS. Even with the account it seems to still need MacOS. Someone other than I will likely need to handle IOS testing!</w:t>
-      </w:r>
-    </w:p>
-    <w:p>
-      <w:pPr>
-        <w:rPr>
-          <w:b/>
-          <w:bCs/>
-        </w:rPr>
-      </w:pPr>
-      <w:r>
-        <w:rPr>
-          <w:b/>
-          <w:bCs/>
-        </w:rPr>
-        <w:t xml:space="preserve">Action Item: </w:t>
-      </w:r>
-      <w:r>
-        <w:rPr>
-          <w:b/>
-          <w:bCs/>
-        </w:rPr>
-        <w:t>Mentally prepare to need a developer build setup. Decide who will test IOS and android specific builds.</w:t>
-      </w:r>
-    </w:p>
-    <w:p/>
-    <w:p>
-      <w:pPr>
-        <w:rPr>
-          <w:b/>
-          <w:bCs/>
-          <w:sz w:val="32"/>
-          <w:szCs w:val="32"/>
-          <w:u w:val="single"/>
-        </w:rPr>
-      </w:pPr>
-      <w:r>
-        <w:rPr>
-          <w:b/>
-          <w:bCs/>
-          <w:sz w:val="32"/>
-          <w:szCs w:val="32"/>
-          <w:u w:val="single"/>
-        </w:rPr>
-        <w:t>Permissions</w:t>
-      </w:r>
-    </w:p>
-    <w:p>
-      <w:r>
-        <w:t xml:space="preserve">This example code was provided </w:t>
-      </w:r>
-      <w:hyperlink r:id="rId18" w:history="1">
-        <w:r>
-          <w:rPr>
-            <w:rStyle w:val="Hyperlink"/>
-          </w:rPr>
-          <w:t>HERE</w:t>
-        </w:r>
+        <w:t>- Guide on GATT.</w:t>
+      </w:r>
+    </w:p>
+    <w:p>
+      <w:hyperlink r:id="rId31" w:history="1">
+        <w:r>
+          <w:rPr>
+            <w:rStyle w:val="Hyperlink"/>
+          </w:rPr>
+          <w:t xml:space="preserve">Bluetooth vs Bluetooth Low Energy - </w:t>
+        </w:r>
+        <w:proofErr w:type="spellStart"/>
+        <w:r>
+          <w:rPr>
+            <w:rStyle w:val="Hyperlink"/>
+          </w:rPr>
+          <w:t>GeeksforGeeks</w:t>
+        </w:r>
+        <w:proofErr w:type="spellEnd"/>
       </w:hyperlink>
       <w:r>
-        <w:t xml:space="preserve"> to get permissions from IOS and Android for Bluetooth. I haven’t tested it yet but it seems like a good starting point.</w:t>
-      </w:r>
-    </w:p>
-    <w:p>
-      <w:pPr>
-        <w:pStyle w:val="NoSpacing"/>
-        <w:ind w:left="720"/>
-      </w:pPr>
-      <w:r>
-        <w:t>import { PermissionsAndroid, Platform } from 'react-native';</w:t>
-      </w:r>
-    </w:p>
-    <w:p>
-      <w:pPr>
-        <w:pStyle w:val="NoSpacing"/>
-        <w:ind w:left="720"/>
-      </w:pPr>
-      <w:r>
-        <w:t xml:space="preserve">const </w:t>
-      </w:r>
-      <w:proofErr w:type="spellStart"/>
-      <w:r>
-        <w:t>requestPermissions</w:t>
-      </w:r>
-      <w:proofErr w:type="spellEnd"/>
-      <w:r>
-        <w:t xml:space="preserve"> = async () =&gt; {</w:t>
-      </w:r>
-      <w:r>
-        <w:br/>
-        <w:t xml:space="preserve">  if (</w:t>
-      </w:r>
-      <w:proofErr w:type="spellStart"/>
-      <w:r>
-        <w:t>Platform.OS</w:t>
-      </w:r>
-      <w:proofErr w:type="spellEnd"/>
-      <w:r>
-        <w:t xml:space="preserve"> === 'android') {</w:t>
-      </w:r>
-      <w:r>
-        <w:br/>
-        <w:t xml:space="preserve">    // Android 12+ (API 31) requires these</w:t>
-      </w:r>
-      <w:r>
-        <w:br/>
-        <w:t xml:space="preserve">    if (</w:t>
-      </w:r>
-      <w:proofErr w:type="spellStart"/>
-      <w:r>
-        <w:t>Platform.Version</w:t>
-      </w:r>
-      <w:proofErr w:type="spellEnd"/>
-      <w:r>
-        <w:t xml:space="preserve"> &gt;= 31) {</w:t>
-      </w:r>
-      <w:r>
-        <w:br/>
-        <w:t xml:space="preserve">      const granted = await </w:t>
-      </w:r>
-      <w:proofErr w:type="spellStart"/>
-      <w:r>
-        <w:t>PermissionsAndroid.requestMultiple</w:t>
-      </w:r>
-      <w:proofErr w:type="spellEnd"/>
-      <w:r>
-        <w:t>([</w:t>
-      </w:r>
-      <w:r>
-        <w:br/>
-      </w:r>
-      <w:r>
-        <w:lastRenderedPageBreak/>
-        <w:t xml:space="preserve">        </w:t>
-      </w:r>
-      <w:proofErr w:type="spellStart"/>
-      <w:r>
-        <w:t>PermissionsAndroid.PERMISSIONS.BLUETOOTH_SCAN</w:t>
-      </w:r>
-      <w:proofErr w:type="spellEnd"/>
-      <w:r>
-        <w:t>,</w:t>
-      </w:r>
-      <w:r>
-        <w:br/>
-        <w:t xml:space="preserve">        </w:t>
-      </w:r>
-      <w:proofErr w:type="spellStart"/>
-      <w:r>
-        <w:t>PermissionsAndroid.PERMISSIONS.BLUETOOTH_CONNECT</w:t>
-      </w:r>
-      <w:proofErr w:type="spellEnd"/>
-      <w:r>
-        <w:t>,</w:t>
-      </w:r>
-      <w:r>
-        <w:br/>
-        <w:t xml:space="preserve">        </w:t>
-      </w:r>
-      <w:proofErr w:type="spellStart"/>
-      <w:r>
-        <w:t>PermissionsAndroid.PERMISSIONS.ACCESS_FINE_LOCATION</w:t>
-      </w:r>
-      <w:proofErr w:type="spellEnd"/>
-      <w:r>
-        <w:t>,</w:t>
-      </w:r>
-      <w:r>
-        <w:br/>
-        <w:t xml:space="preserve">      ]);</w:t>
-      </w:r>
-      <w:r>
-        <w:br/>
-        <w:t xml:space="preserve">      return (</w:t>
-      </w:r>
-      <w:r>
-        <w:br/>
-        <w:t xml:space="preserve">        granted['</w:t>
-      </w:r>
-      <w:proofErr w:type="spellStart"/>
-      <w:r>
-        <w:t>android.permission.BLUETOOTH_SCAN</w:t>
-      </w:r>
-      <w:proofErr w:type="spellEnd"/>
-      <w:r>
-        <w:t xml:space="preserve">'] === </w:t>
-      </w:r>
-      <w:proofErr w:type="spellStart"/>
-      <w:r>
-        <w:t>PermissionsAndroid.RESULTS.GRANTED</w:t>
-      </w:r>
-      <w:proofErr w:type="spellEnd"/>
-      <w:r>
-        <w:t xml:space="preserve"> &amp;&amp;</w:t>
-      </w:r>
-      <w:r>
-        <w:br/>
-        <w:t xml:space="preserve">        granted['</w:t>
-      </w:r>
-      <w:proofErr w:type="spellStart"/>
-      <w:r>
-        <w:t>android.permission.BLUETOOTH_CONNECT</w:t>
-      </w:r>
-      <w:proofErr w:type="spellEnd"/>
-      <w:r>
-        <w:t xml:space="preserve">'] === </w:t>
-      </w:r>
-      <w:proofErr w:type="spellStart"/>
-      <w:r>
-        <w:t>PermissionsAndroid.RESULTS.GRANTED</w:t>
-      </w:r>
-      <w:proofErr w:type="spellEnd"/>
-      <w:r>
-        <w:br/>
-        <w:t xml:space="preserve">      );</w:t>
-      </w:r>
-      <w:r>
-        <w:br/>
-        <w:t xml:space="preserve">    } </w:t>
-      </w:r>
-      <w:r>
-        <w:br/>
-        <w:t xml:space="preserve">    // Older Android versions mainly need Location for scanning</w:t>
-      </w:r>
-      <w:r>
-        <w:br/>
-        <w:t xml:space="preserve">    const granted = await </w:t>
-      </w:r>
-      <w:proofErr w:type="spellStart"/>
-      <w:r>
-        <w:t>PermissionsAndroid.request</w:t>
-      </w:r>
-      <w:proofErr w:type="spellEnd"/>
-      <w:r>
-        <w:t>(</w:t>
-      </w:r>
-      <w:r>
-        <w:br/>
-        <w:t xml:space="preserve">      </w:t>
-      </w:r>
-      <w:proofErr w:type="spellStart"/>
-      <w:r>
-        <w:t>PermissionsAndroid.PERMISSIONS.ACCESS_FINE_LOCATION</w:t>
-      </w:r>
-      <w:proofErr w:type="spellEnd"/>
-      <w:r>
-        <w:br/>
-        <w:t xml:space="preserve">    );</w:t>
-      </w:r>
-      <w:r>
-        <w:br/>
-        <w:t xml:space="preserve">    return granted === </w:t>
-      </w:r>
-      <w:proofErr w:type="spellStart"/>
-      <w:r>
-        <w:t>PermissionsAndroid.RESULTS.GRANTED</w:t>
-      </w:r>
-      <w:proofErr w:type="spellEnd"/>
-      <w:r>
-        <w:t>;</w:t>
-      </w:r>
-      <w:r>
-        <w:br/>
-        <w:t xml:space="preserve">  }</w:t>
-      </w:r>
-      <w:r>
-        <w:br/>
-        <w:t xml:space="preserve">  // iOS permissions are handled by the library/</w:t>
-      </w:r>
-      <w:proofErr w:type="spellStart"/>
-      <w:r>
-        <w:t>Info.plist</w:t>
-      </w:r>
-      <w:proofErr w:type="spellEnd"/>
-      <w:r>
-        <w:br/>
-        <w:t xml:space="preserve">  return true; </w:t>
-      </w:r>
-      <w:r>
-        <w:br/>
-        <w:t>};</w:t>
-      </w:r>
-    </w:p>
-    <w:p/>
-    <w:p>
-      <w:r>
-        <w:t>There is also a</w:t>
-      </w:r>
-      <w:r>
-        <w:t>n extensive</w:t>
-      </w:r>
-      <w:r>
-        <w:t xml:space="preserve"> plx example </w:t>
-      </w:r>
-      <w:hyperlink r:id="rId19" w:history="1">
-        <w:r>
-          <w:rPr>
-            <w:rStyle w:val="Hyperlink"/>
-          </w:rPr>
-          <w:t>here</w:t>
-        </w:r>
-      </w:hyperlink>
-      <w:r>
-        <w:t>.</w:t>
-      </w:r>
-    </w:p>
-    <w:p>
-      <w:pPr>
-        <w:rPr>
-          <w:b/>
-          <w:bCs/>
-        </w:rPr>
-      </w:pPr>
-      <w:r>
-        <w:rPr>
-          <w:b/>
-          <w:bCs/>
-        </w:rPr>
-        <w:t xml:space="preserve">Action Item: </w:t>
-      </w:r>
-      <w:r>
-        <w:rPr>
-          <w:b/>
-          <w:bCs/>
-        </w:rPr>
-        <w:t>None for now.</w:t>
-      </w:r>
-    </w:p>
-    <w:p/>
+        <w:t xml:space="preserve"> – Comparison between Bluetooth Classic and Bluetooth Low Energy.</w:t>
+      </w:r>
+    </w:p>
     <w:sectPr>
       <w:pgSz w:w="12240" w:h="15840"/>
       <w:pgMar w:top="1440" w:right="1440" w:bottom="1440" w:left="1440" w:header="720" w:footer="720" w:gutter="0"/>
@@ -2032,6 +2432,48 @@
       <w:spacing w:after="0" w:line="240" w:lineRule="auto"/>
     </w:pPr>
   </w:style>
+  <w:style w:type="character" w:styleId="FollowedHyperlink">
+    <w:name w:val="FollowedHyperlink"/>
+    <w:basedOn w:val="DefaultParagraphFont"/>
+    <w:uiPriority w:val="99"/>
+    <w:semiHidden/>
+    <w:unhideWhenUsed/>
+    <w:rsid w:val="004419D0"/>
+    <w:rPr>
+      <w:color w:val="96607D" w:themeColor="followedHyperlink"/>
+      <w:u w:val="single"/>
+    </w:rPr>
+  </w:style>
+  <w:style w:type="paragraph" w:styleId="HTMLPreformatted">
+    <w:name w:val="HTML Preformatted"/>
+    <w:basedOn w:val="Normal"/>
+    <w:link w:val="HTMLPreformattedChar"/>
+    <w:uiPriority w:val="99"/>
+    <w:semiHidden/>
+    <w:unhideWhenUsed/>
+    <w:rsid w:val="00ED70A0"/>
+    <w:pPr>
+      <w:spacing w:after="0" w:line="240" w:lineRule="auto"/>
+    </w:pPr>
+    <w:rPr>
+      <w:rFonts w:ascii="Consolas" w:hAnsi="Consolas"/>
+      <w:sz w:val="20"/>
+      <w:szCs w:val="20"/>
+    </w:rPr>
+  </w:style>
+  <w:style w:type="character" w:customStyle="1" w:styleId="HTMLPreformattedChar">
+    <w:name w:val="HTML Preformatted Char"/>
+    <w:basedOn w:val="DefaultParagraphFont"/>
+    <w:link w:val="HTMLPreformatted"/>
+    <w:uiPriority w:val="99"/>
+    <w:semiHidden/>
+    <w:rsid w:val="00ED70A0"/>
+    <w:rPr>
+      <w:rFonts w:ascii="Consolas" w:hAnsi="Consolas"/>
+      <w:sz w:val="20"/>
+      <w:szCs w:val="20"/>
+    </w:rPr>
+  </w:style>
 </w:styles>
 </file>
 

</xml_diff>